<commit_message>
Refresh final submission Word documents
</commit_message>
<xml_diff>
--- a/output/word/response-to-reviewers.docx
+++ b/output/word/response-to-reviewers.docx
@@ -58,7 +58,7 @@
           <w:color w:val="000000"/>
           <w:sz w:val="21"/>
         </w:rPr>
-        <w:t>Wind Associations with Overwintering Monarch Butterfly Cluster Size Depend on Temperature and Sun Exposure</w:t>
+        <w:t>Does Wind Disrupt Overwintering Monarch Butterfly Clusters? An Observational Study of Western Monarchs</w:t>
         <w:br/>
       </w:r>
       <w:r>
@@ -99,7 +99,7 @@
           <w:color w:val="000000"/>
           <w:sz w:val="22"/>
         </w:rPr>
-        <w:t>Thank you for the careful and constructive reviews. We substantially shortened the manuscript and revised its analyses, interpretation, and scope. The revised title and all summary sections now describe conditional associations under the monitored conditions rather than a general or causal rejection of wind effects. We removed unsupported analyses and management recommendations, clarified the environmental and image-based measurements, repeated the candidate-model comparisons, added sensitivity analyses, and made the processed data and analytical materials public. The responses below address every comment. Manuscript sections are named directly because line numbers may change during journal production.</w:t>
+        <w:t>Thank you for the careful and constructive reviews. The manuscript is substantially stronger because of this feedback. We shortened the paper and revised its analyses, interpretation, and scope. The revised title and all summary sections now describe conditional associations under the monitored conditions rather than a general or causal rejection of wind effects. We removed unsupported analyses and management recommendations, clarified the environmental and image-based measurements, repeated the candidate-model comparisons, added sensitivity analyses, and made the processed data and analytical materials public. The responses below address every comment. Manuscript sections are named directly because line numbers may change during journal production.</w:t>
       </w:r>
     </w:p>
     <w:p>
@@ -173,7 +173,7 @@
           <w:color w:val="000000"/>
           <w:sz w:val="22"/>
         </w:rPr>
-        <w:t>We agree. The revised manuscript consistently identifies the study as observational and limits inference to two blue gum eucalyptus groves, one overwintering season, the observed cluster sizes, and nearby maximum-gust measurements. We replaced the categorical title with “Wind Associations with Overwintering Monarch Butterfly Cluster Size Depend on Temperature and Sun Exposure.” The Simple Summary, Abstract, Discussion, and Conclusions now state that the predicted consistent decline was not detected under the monitored conditions. We also removed prescriptive habitat-management recommendations and added an explicit need for replication across seasons, sites, grove structures, cluster densities, and geographic regions.</w:t>
+        <w:t>We agree. The revised manuscript consistently identifies the study as observational and limits inference to two blue gum eucalyptus groves, one overwintering season, the observed cluster sizes, and nearby maximum-gust measurements. We replaced the categorical title with the question “Does Wind Disrupt Overwintering Monarch Butterfly Clusters? An Observational Study of Western Monarchs.” The Simple Summary, Abstract, Discussion, and Conclusions now state that the predicted consistent decline was not detected under the monitored conditions. We also removed prescriptive habitat-management recommendations and added an explicit need for replication across seasons, sites, grove structures, cluster densities, and geographic regions.</w:t>
       </w:r>
     </w:p>
     <w:p>
@@ -239,7 +239,7 @@
           <w:color w:val="000000"/>
           <w:sz w:val="22"/>
         </w:rPr>
-        <w:t>We substantially reduced the manuscript. We removed the simple linear regressions, the fixed 24-hour analysis, the threshold-duration analysis, and the simulation-based power analysis. We also removed their associated figures, tables, appendices, and discussion. The main text now focuses on the 30-minute and Next Day response windows and contains four figures and no main-text tables. Technical formulas and candidate mappings are confined to the appendix and public reproducibility files. The physiology section is shorter and explicitly presents thermoregulation and energetic constraints as hypotheses for future testing, not demonstrated mechanisms.</w:t>
+        <w:t>We substantially reduced the manuscript. We removed the simple linear regressions, the fixed 24-hour analysis, the threshold-duration analysis, and the simulation-based power analysis. We also removed their associated figures, tables, appendices, and discussion. The main text now focuses on our strongest results, the 30-minute and Next Day response windows, and contains four figures and no main-text tables. Technical formulas and candidate mappings are confined to the appendix and public reproducibility files. The physiology section is shorter and explicitly presents thermoregulation and energetic constraints as hypotheses for future testing, not demonstrated mechanisms.</w:t>
       </w:r>
     </w:p>
     <w:p>
@@ -305,7 +305,7 @@
           <w:color w:val="000000"/>
           <w:sz w:val="22"/>
         </w:rPr>
-        <w:t>We removed the population-decline framing from the Simple Summary, Abstract, Introduction, Discussion, and Conclusions. The revised Introduction begins with overwintering aggregation ecology and focuses directly on the history and evaluation of wind-related habitat assumptions.</w:t>
+        <w:t>We removed the population-decline framing from the Simple Summary, Abstract, Introduction, Discussion, and Conclusions. The revised Introduction is limited to the ecological and historical background needed to explain the motivation for the study and the wind-related prediction we evaluated.</w:t>
       </w:r>
     </w:p>
     <w:p>
@@ -577,7 +577,7 @@
           <w:color w:val="000000"/>
           <w:sz w:val="22"/>
         </w:rPr>
-        <w:t>We now define that scope in the Study Design, Discussion, and Conclusions. The Discussion further states that nearly all 30-minute observations came from one grove and that only Spring Canyon contributed to the Next Day analysis. The Conclusions call for replicated work across seasons, sites, grove structures, cluster densities, and regions before management guidance is revised.</w:t>
+        <w:t>We now define that scope in the Study Design, Discussion, and Conclusions. The Discussion further states that nearly all 30-minute observations came from one grove and that only Spring Canyon contributed to the Next Day analysis. The Conclusions call for replicated work across seasons, sites, grove structures, cluster densities, and regions to determine whether the result extends beyond the monitored setting.</w:t>
       </w:r>
     </w:p>
     <w:p>
@@ -643,7 +643,7 @@
           <w:color w:val="000000"/>
           <w:sz w:val="22"/>
         </w:rPr>
-        <w:t>The Monitoring System subsection now reports pole heights of 5.4 to 9.4 m and horizontal cluster distances of 4.2 to 16.5 m. Appendix A provides the recorded height, horizontal distance, and camera bearing for every analyzed deployment. Cluster heights, vertical sensor-to-cluster distances, intervening vegetation, and canopy positions were not recorded systematically, so we state that they cannot be reconstructed. We also state that the loggers were screened for gross abnormalities and compared during overlapping deployments but were not calibrated against a reference sensor or validated at butterfly positions. Wind direction was not analyzed because the focal historical prediction concerned wind-speed magnitude and the logger compass headings were not considered reliable enough for directional inference after prolonged coastal exposure. Throughout the manuscript, the values are described as nearby pole-position measurements rather than within-canopy exposure at individual butterflies.</w:t>
+        <w:t>The Monitoring System subsection now reports pole heights of 5.4 to 9.4 m and horizontal cluster distances of 4.2 to 16.5 m. Appendix A provides the recorded height, horizontal distance, and camera bearing for every analyzed deployment. Cluster heights, vertical sensor-to-cluster distances, intervening vegetation, and canopy positions were not recorded systematically, so we state that they cannot be reconstructed. We also state that the loggers were screened for gross abnormalities and compared during overlapping deployments but were not calibrated against a reference sensor or validated at butterfly positions. Wind direction was not analyzed because the focal historical prediction concerned wind-speed magnitude. Directional exposure at the butterflies also could not be inferred from a pole heading without measurements of the intervening canopy and its effects on airflow. Throughout the manuscript, the values are described as nearby pole-position measurements rather than within-canopy exposure at individual butterflies.</w:t>
       </w:r>
     </w:p>
     <w:p>
@@ -709,7 +709,7 @@
           <w:color w:val="000000"/>
           <w:sz w:val="22"/>
         </w:rPr>
-        <w:t>We agree. We removed the threshold-duration analysis, its model appendix, and all associated claims. The manuscript retains maximum gusts only as descriptive and continuous predictors. It explicitly states that one-minute maximum-gust records near the clusters do not measure sustained exposure above 2 m/s at butterfly positions and therefore do not provide an exact test of the historical threshold formulation.</w:t>
+        <w:t>We agree. We removed the threshold-duration analysis, its model appendix, and all associated claims. The manuscript retains maximum gust as a descriptive and continuous predictor. Average wind speed, modal gust, gust variability, and maximum gust were strongly correlated, so they contained substantially overlapping information. We selected maximum gust as the most direct continuous metric for the disruption prediction evaluated here. The manuscript explicitly states that one-minute maximum-gust records near the clusters do not measure sustained exposure above 2 m/s at butterfly positions and therefore do not provide an exact test of the historical threshold formulation.</w:t>
       </w:r>
     </w:p>
     <w:p>
@@ -841,7 +841,7 @@
           <w:color w:val="000000"/>
           <w:sz w:val="22"/>
         </w:rPr>
-        <w:t>The camera temperatures were not independently validated against calibrated environmental sensors. The Methods now describe them as approximate local measurements that may reflect camera housing and solar exposure as well as ambient air temperature. The Discussion notes that the displayed temperatures are not precise air or butterfly body temperatures. We also state that solar irradiance, humidity, vapor pressure deficit, precipitation, and surface wetness were not measured. These omissions limit causal attribution because unmeasured conditions may covary with wind and visible cluster change.</w:t>
+        <w:t>The camera temperatures were not independently validated against calibrated environmental sensors. The Methods now describe them as approximate local measurements that may reflect camera housing and solar exposure as well as ambient air temperature. The Discussion notes that the displayed temperatures are not precise air or butterfly body temperatures. The study was designed specifically to evaluate the wind prediction while building on earlier work that measured a broader set of microclimate conditions. We now state explicitly that solar irradiance, humidity, vapor pressure deficit, precipitation, and surface wetness were not measured, and we avoid attributing visible cluster changes to wind alone.</w:t>
       </w:r>
     </w:p>
     <w:p>
@@ -945,7 +945,7 @@
           <w:color w:val="000000"/>
           <w:sz w:val="22"/>
         </w:rPr>
-        <w:t>The poles were guyed and the camera view remained fixed within each deployment, but camera, pole, and vegetation movement during high winds was not quantified. We added this limitation. Wind-driven branch movement could redistribute a visible aggregation among grid cells and create short-term BI error. We therefore interpret changes as visible BI change, not confirmed arrival, departure, or dislodgment.</w:t>
+        <w:t>The cameras had unobstructed views of the monitored aggregation areas, and only visible butterflies were counted. The guyed poles remained stable and did not visibly move or rotate during the included deployments. Images affected by the few pole falls were excluded. Branch movement was present and was addressed by manual classification of every image under a shared protocol. Residual short-term classification noise remains possible when a visible group falls near a BI category boundary, so we continue to interpret the response as visible BI change rather than confirmed arrival, departure, or dislodgment.</w:t>
       </w:r>
     </w:p>
     <w:p>
@@ -1115,7 +1115,7 @@
           <w:color w:val="000000"/>
           <w:sz w:val="22"/>
         </w:rPr>
-        <w:t>The corrected 30-minute winner changed from the previously reported M50 structure to the full linear wind by temperature by sun-exposed BI interaction, corresponding to legacy M16. It received an AICc of 8052.02 and weight greater than 0.9999 in the primary set and remained first in both adjustment sensitivities. In the Next Day analysis, the centered wind by sun-exposed BI tensor interaction, corresponding to legacy M32, remained first, but support was not decisive. Its AICc weight was 0.368, a maximum-temperature-only model was within two AICc units, and the adjustment-only model was 3.58 units higher. The revised Methods, Results, appendices, and public output tables report the full strategy and uncertainty.</w:t>
+        <w:t>The corrected 30-minute best model changed to a three-way interaction among wind, temperature, and sun-exposed BI. We updated the Results, figures, and interpretation accordingly. The Next Day best model remained a wind by sun-exposed BI interaction, although its support was less decisive after correction. The overall result remains that the wind association was not a consistent decline in visible cluster size. Instead, it depended on temperature and sun-exposed BI. We believe the corrected analysis and more transparent treatment of uncertainty make the paper stronger. The revised Methods, Results, appendices, and public output tables provide the full statistical details.</w:t>
       </w:r>
     </w:p>
     <w:p>
@@ -1313,7 +1313,7 @@
           <w:color w:val="000000"/>
           <w:sz w:val="22"/>
         </w:rPr>
-        <w:t>We shortened the physiological discussion and explicitly state that thermoregulation and energetic constraints are possible explanations for future testing. The study did not measure irradiance, thoracic temperature, convective heat transfer, metabolic expenditure, lipid depletion, or movement among roosts. We removed recommendations to simplify buffers, increase wind access, open canopies, or thin groves. The Conclusions now state that the results raise questions about a single-threshold formulation in the monitored setting but do not establish that existing guidance is broadly invalid.</w:t>
+        <w:t>We shortened the physiological discussion and explicitly state that thermoregulation and energetic constraints are possible explanations for future testing. The study did not measure irradiance, thoracic temperature, convective heat transfer, metabolic expenditure, lipid depletion, or movement among roosts. We removed all management recommendations. The manuscript now reports what we observed, offers a possible physiological explanation, and states that we did not find evidence that a single wind threshold consistently predicted declines in visible cluster size under the monitored conditions.</w:t>
       </w:r>
     </w:p>
     <w:p>
@@ -1379,7 +1379,7 @@
           <w:color w:val="000000"/>
           <w:sz w:val="22"/>
         </w:rPr>
-        <w:t>We changed the Data Availability statement and made the version-controlled repository public at github.com/kylenessen/monarch-wind-light-manuscript (https://github.com/kylenessen/monarch-wind-light-manuscript). It contains processed data, deployment metadata, image classifications, analysis code, candidate formulas, fit outcomes, selected-model summaries, sensitivity outputs, and generated figures. The illustrated classification protocol is public at kylenessen.github.io/monarch_trailcam_classifier (https://kylenessen.github.io/monarch_trailcam_classifier/). The repository also documents the OCR and manual-review procedure and preserves the reviewed image-derived temperature values. The original OCR extraction utility is not part of the repository, and we state this rather than claiming it is available. Raw images and the classification review software remain available from the corresponding author because a long-term public host has not been established. A DOI-backed archive of the final repository release will be created before publication.</w:t>
+        <w:t>We changed the Data Availability statement and made the version-controlled repository public at github.com/kylenessen/monarch-wind-light-manuscript (https://github.com/kylenessen/monarch-wind-light-manuscript). It contains processed data, deployment metadata, image classifications, analysis code, candidate formulas, fit outcomes, selected-model summaries, sensitivity outputs, and generated figures. The illustrated classification protocol is public at kylenessen.github.io/monarch_trailcam_classifier (https://kylenessen.github.io/monarch_trailcam_classifier/). The repository also documents the OCR and manual-review procedure and preserves the reviewed image-derived temperature values. The original OCR extraction utility is not part of the repository, and we state this rather than claiming it is available. The raw images and classification review software remain available from the corresponding author during review. Upon acceptance, we will release them publicly and create a DOI-backed archive of the final repository release.</w:t>
       </w:r>
     </w:p>
     <w:p>
@@ -1585,7 +1585,7 @@
           <w:color w:val="000000"/>
           <w:sz w:val="22"/>
         </w:rPr>
-        <w:t>We now state this limitation in the Study Design, Discussion, and Conclusions. The Conclusions call for replicated research across seasons, sites, grove structures, cluster densities, weather conditions, and regions before broader inference or changes to management guidance.</w:t>
+        <w:t>We now state this limitation in the Study Design, Discussion, and Conclusions. The Conclusions call for replicated research across seasons, sites, grove structures, cluster densities, and regions before drawing broader inferences.</w:t>
       </w:r>
     </w:p>
     <w:p>
@@ -1717,7 +1717,7 @@
           <w:color w:val="000000"/>
           <w:sz w:val="22"/>
         </w:rPr>
-        <w:t>We removed the broad management recommendations and revised the Conclusions. The manuscript now states that the findings raise questions about applying a single wind threshold in the monitored setting, not that all wind-related management thresholds are invalid. It calls for controlled and replicated work across habitats, densities, seasons, and regions before management guidance is revised.</w:t>
+        <w:t>We removed the management recommendations and revised the Conclusions. The manuscript now states that we did not find evidence that a single wind threshold consistently predicted declines in visible cluster size under the monitored conditions. It calls for replicated work across seasons, sites, grove structures, cluster densities, and regions to determine whether this result extends beyond the monitored setting.</w:t>
       </w:r>
     </w:p>
     <w:p>

</xml_diff>

<commit_message>
Refresh response letter exports
</commit_message>
<xml_diff>
--- a/output/word/response-to-reviewers.docx
+++ b/output/word/response-to-reviewers.docx
@@ -1722,6 +1722,14 @@
     </w:p>
     <w:p>
       <w:pPr>
+        <w:pStyle w:val="Heading1"/>
+      </w:pPr>
+      <w:r>
+        <w:t>Internal USGS Review, Zach Ancona</w:t>
+      </w:r>
+    </w:p>
+    <w:p>
+      <w:pPr>
         <w:spacing w:before="0" w:after="120" w:line="264" w:lineRule="auto"/>
       </w:pPr>
       <w:r>
@@ -1732,7 +1740,814 @@
           <w:color w:val="000000"/>
           <w:sz w:val="22"/>
         </w:rPr>
-        <w:t>We again thank the Academic Editor and both reviewers. Their comments led to a shorter, more transparent manuscript with narrower claims, corrected model comparisons, clearer measurement limitations, and stronger reproducibility materials.</w:t>
+        <w:t>The comments in this section were recovered from the internal-review annotations transcribed into the manuscript source. Repeated comments on the same terminology or caption issue are consolidated below.</w:t>
+      </w:r>
+    </w:p>
+    <w:p>
+      <w:pPr>
+        <w:pStyle w:val="Heading2"/>
+        <w:keepNext/>
+      </w:pPr>
+      <w:r>
+        <w:t>Overall assessment</w:t>
+      </w:r>
+    </w:p>
+    <w:p>
+      <w:pPr>
+        <w:keepNext/>
+        <w:spacing w:before="0" w:after="80" w:line="264" w:lineRule="auto"/>
+        <w:ind w:left="72" w:right="72"/>
+        <w:shd w:fill="F2F5F7"/>
+      </w:pPr>
+      <w:r>
+        <w:rPr>
+          <w:rFonts w:ascii="Calibri" w:hAnsi="Calibri"/>
+          <w:b/>
+          <w:i w:val="0"/>
+          <w:color w:val="000000"/>
+          <w:sz w:val="22"/>
+        </w:rPr>
+        <w:t xml:space="preserve">Comment. </w:t>
+      </w:r>
+      <w:r>
+        <w:rPr>
+          <w:rFonts w:ascii="Calibri" w:hAnsi="Calibri"/>
+          <w:b w:val="0"/>
+          <w:i w:val="0"/>
+          <w:color w:val="000000"/>
+          <w:sz w:val="22"/>
+        </w:rPr>
+        <w:t>Use the name and abbreviation for the Wind Disruption Hypothesis consistently. The modeling and statistical sections were outside the reviewer’s main expertise, but the paper remained understandable and the framing and explanation were strong.</w:t>
+      </w:r>
+    </w:p>
+    <w:p>
+      <w:pPr>
+        <w:spacing w:before="0" w:after="120" w:line="264" w:lineRule="auto"/>
+        <w:ind w:left="173"/>
+        <w:pBdr>
+          <w:left w:val="single" w:sz="18" w:space="7" w:color="2F6F70"/>
+        </w:pBdr>
+      </w:pPr>
+      <w:r>
+        <w:rPr>
+          <w:rFonts w:ascii="Calibri" w:hAnsi="Calibri"/>
+          <w:b/>
+          <w:i w:val="0"/>
+          <w:color w:val="1D5051"/>
+          <w:sz w:val="22"/>
+        </w:rPr>
+        <w:t xml:space="preserve">Response. </w:t>
+      </w:r>
+      <w:r>
+        <w:rPr>
+          <w:rFonts w:ascii="Calibri" w:hAnsi="Calibri"/>
+          <w:b w:val="0"/>
+          <w:i w:val="0"/>
+          <w:color w:val="000000"/>
+          <w:sz w:val="22"/>
+        </w:rPr>
+        <w:t>We thank Zach for the careful review and encouraging assessment. We treated the modeling observation as context rather than a request for a technical change. The manuscript was subsequently revised further in response to the journal reviews, with the statistical methods, candidate comparisons, diagnostics, and sensitivity analyses described more explicitly.</w:t>
+      </w:r>
+    </w:p>
+    <w:p>
+      <w:pPr>
+        <w:pStyle w:val="Heading2"/>
+        <w:keepNext/>
+      </w:pPr>
+      <w:r>
+        <w:t>Comment 1. Wind Disruption Hypothesis terminology</w:t>
+      </w:r>
+    </w:p>
+    <w:p>
+      <w:pPr>
+        <w:keepNext/>
+        <w:spacing w:before="0" w:after="80" w:line="264" w:lineRule="auto"/>
+        <w:ind w:left="72" w:right="72"/>
+        <w:shd w:fill="F2F5F7"/>
+      </w:pPr>
+      <w:r>
+        <w:rPr>
+          <w:rFonts w:ascii="Calibri" w:hAnsi="Calibri"/>
+          <w:b/>
+          <w:i w:val="0"/>
+          <w:color w:val="000000"/>
+          <w:sz w:val="22"/>
+        </w:rPr>
+        <w:t xml:space="preserve">Comment. </w:t>
+      </w:r>
+      <w:r>
+        <w:rPr>
+          <w:rFonts w:ascii="Calibri" w:hAnsi="Calibri"/>
+          <w:b w:val="0"/>
+          <w:i w:val="0"/>
+          <w:color w:val="000000"/>
+          <w:sz w:val="22"/>
+        </w:rPr>
+        <w:t>The manuscript alternated between “Wind Disruption Hypothesis” and “Disruptive Wind Hypothesis,” and between WDH and DWH. Use one form consistently throughout.</w:t>
+      </w:r>
+    </w:p>
+    <w:p>
+      <w:pPr>
+        <w:spacing w:before="0" w:after="120" w:line="264" w:lineRule="auto"/>
+        <w:ind w:left="173"/>
+        <w:pBdr>
+          <w:left w:val="single" w:sz="18" w:space="7" w:color="2F6F70"/>
+        </w:pBdr>
+      </w:pPr>
+      <w:r>
+        <w:rPr>
+          <w:rFonts w:ascii="Calibri" w:hAnsi="Calibri"/>
+          <w:b/>
+          <w:i w:val="0"/>
+          <w:color w:val="1D5051"/>
+          <w:sz w:val="22"/>
+        </w:rPr>
+        <w:t xml:space="preserve">Response. </w:t>
+      </w:r>
+      <w:r>
+        <w:rPr>
+          <w:rFonts w:ascii="Calibri" w:hAnsi="Calibri"/>
+          <w:b w:val="0"/>
+          <w:i w:val="0"/>
+          <w:color w:val="000000"/>
+          <w:sz w:val="22"/>
+        </w:rPr>
+        <w:t>We agree. We standardized the term as “Wind Disruption Hypothesis.” The current manuscript uses the full term rather than alternating between names or abbreviations.</w:t>
+      </w:r>
+    </w:p>
+    <w:p>
+      <w:pPr>
+        <w:pStyle w:val="Heading2"/>
+        <w:keepNext/>
+      </w:pPr>
+      <w:r>
+        <w:t>Comment 2. Site identifiers</w:t>
+      </w:r>
+    </w:p>
+    <w:p>
+      <w:pPr>
+        <w:keepNext/>
+        <w:spacing w:before="0" w:after="80" w:line="264" w:lineRule="auto"/>
+        <w:ind w:left="72" w:right="72"/>
+        <w:shd w:fill="F2F5F7"/>
+      </w:pPr>
+      <w:r>
+        <w:rPr>
+          <w:rFonts w:ascii="Calibri" w:hAnsi="Calibri"/>
+          <w:b/>
+          <w:i w:val="0"/>
+          <w:color w:val="000000"/>
+          <w:sz w:val="22"/>
+        </w:rPr>
+        <w:t xml:space="preserve">Comment. </w:t>
+      </w:r>
+      <w:r>
+        <w:rPr>
+          <w:rFonts w:ascii="Calibri" w:hAnsi="Calibri"/>
+          <w:b w:val="0"/>
+          <w:i w:val="0"/>
+          <w:color w:val="000000"/>
+          <w:sz w:val="22"/>
+        </w:rPr>
+        <w:t>Define UDMH before using it and make the Spring Canyon reference clear.</w:t>
+      </w:r>
+    </w:p>
+    <w:p>
+      <w:pPr>
+        <w:spacing w:before="0" w:after="120" w:line="264" w:lineRule="auto"/>
+        <w:ind w:left="173"/>
+        <w:pBdr>
+          <w:left w:val="single" w:sz="18" w:space="7" w:color="2F6F70"/>
+        </w:pBdr>
+      </w:pPr>
+      <w:r>
+        <w:rPr>
+          <w:rFonts w:ascii="Calibri" w:hAnsi="Calibri"/>
+          <w:b/>
+          <w:i w:val="0"/>
+          <w:color w:val="1D5051"/>
+          <w:sz w:val="22"/>
+        </w:rPr>
+        <w:t xml:space="preserve">Response. </w:t>
+      </w:r>
+      <w:r>
+        <w:rPr>
+          <w:rFonts w:ascii="Calibri" w:hAnsi="Calibri"/>
+          <w:b w:val="0"/>
+          <w:i w:val="0"/>
+          <w:color w:val="000000"/>
+          <w:sz w:val="22"/>
+        </w:rPr>
+        <w:t>We clarified both site identifiers in the Study Design and Sites subsection. Spring Canyon is introduced as Spring Canyon (SC), Western Monarch Thanksgiving Count site 2712. UDMH is identified as Western Monarch Thanksgiving Count site 2822, with its coordinates and grove description.</w:t>
+      </w:r>
+    </w:p>
+    <w:p>
+      <w:pPr>
+        <w:pStyle w:val="Heading2"/>
+        <w:keepNext/>
+      </w:pPr>
+      <w:r>
+        <w:t>Comment 3. Monitoring-system opening</w:t>
+      </w:r>
+    </w:p>
+    <w:p>
+      <w:pPr>
+        <w:keepNext/>
+        <w:spacing w:before="0" w:after="80" w:line="264" w:lineRule="auto"/>
+        <w:ind w:left="72" w:right="72"/>
+        <w:shd w:fill="F2F5F7"/>
+      </w:pPr>
+      <w:r>
+        <w:rPr>
+          <w:rFonts w:ascii="Calibri" w:hAnsi="Calibri"/>
+          <w:b/>
+          <w:i w:val="0"/>
+          <w:color w:val="000000"/>
+          <w:sz w:val="22"/>
+        </w:rPr>
+        <w:t xml:space="preserve">Comment. </w:t>
+      </w:r>
+      <w:r>
+        <w:rPr>
+          <w:rFonts w:ascii="Calibri" w:hAnsi="Calibri"/>
+          <w:b w:val="0"/>
+          <w:i w:val="0"/>
+          <w:color w:val="000000"/>
+          <w:sz w:val="22"/>
+        </w:rPr>
+        <w:t>The opening sentence describing the equipment and changes in monarch abundance was difficult to read and should be reworded.</w:t>
+      </w:r>
+    </w:p>
+    <w:p>
+      <w:pPr>
+        <w:spacing w:before="0" w:after="120" w:line="264" w:lineRule="auto"/>
+        <w:ind w:left="173"/>
+        <w:pBdr>
+          <w:left w:val="single" w:sz="18" w:space="7" w:color="2F6F70"/>
+        </w:pBdr>
+      </w:pPr>
+      <w:r>
+        <w:rPr>
+          <w:rFonts w:ascii="Calibri" w:hAnsi="Calibri"/>
+          <w:b/>
+          <w:i w:val="0"/>
+          <w:color w:val="1D5051"/>
+          <w:sz w:val="22"/>
+        </w:rPr>
+        <w:t xml:space="preserve">Response. </w:t>
+      </w:r>
+      <w:r>
+        <w:rPr>
+          <w:rFonts w:ascii="Calibri" w:hAnsi="Calibri"/>
+          <w:b w:val="0"/>
+          <w:i w:val="0"/>
+          <w:color w:val="000000"/>
+          <w:sz w:val="22"/>
+        </w:rPr>
+        <w:t>We rewrote and reorganized the monitoring description. The current Monitoring System and Deployment Units subsection begins directly with the pole-mounted equipment and then explains camera placement, image acquisition, wind logging, and the definition of a deployment. Visible cluster size and the Butterfly Index are defined separately in the Image Classification and Derived Variables subsection.</w:t>
+      </w:r>
+    </w:p>
+    <w:p>
+      <w:pPr>
+        <w:pStyle w:val="Heading2"/>
+        <w:keepNext/>
+      </w:pPr>
+      <w:r>
+        <w:t>Comment 4. Sentence structure and colon use</w:t>
+      </w:r>
+    </w:p>
+    <w:p>
+      <w:pPr>
+        <w:keepNext/>
+        <w:spacing w:before="0" w:after="80" w:line="264" w:lineRule="auto"/>
+        <w:ind w:left="72" w:right="72"/>
+        <w:shd w:fill="F2F5F7"/>
+      </w:pPr>
+      <w:r>
+        <w:rPr>
+          <w:rFonts w:ascii="Calibri" w:hAnsi="Calibri"/>
+          <w:b/>
+          <w:i w:val="0"/>
+          <w:color w:val="000000"/>
+          <w:sz w:val="22"/>
+        </w:rPr>
+        <w:t xml:space="preserve">Comment. </w:t>
+      </w:r>
+      <w:r>
+        <w:rPr>
+          <w:rFonts w:ascii="Calibri" w:hAnsi="Calibri"/>
+          <w:b w:val="0"/>
+          <w:i w:val="0"/>
+          <w:color w:val="000000"/>
+          <w:sz w:val="22"/>
+        </w:rPr>
+        <w:t>Several sentences used colons where the relationship between the clauses or listed items was unclear, including the sampling-interval tradeoffs and the definition of the threshold predictor. Recast these as direct sentences.</w:t>
+      </w:r>
+    </w:p>
+    <w:p>
+      <w:pPr>
+        <w:spacing w:before="0" w:after="120" w:line="264" w:lineRule="auto"/>
+        <w:ind w:left="173"/>
+        <w:pBdr>
+          <w:left w:val="single" w:sz="18" w:space="7" w:color="2F6F70"/>
+        </w:pBdr>
+      </w:pPr>
+      <w:r>
+        <w:rPr>
+          <w:rFonts w:ascii="Calibri" w:hAnsi="Calibri"/>
+          <w:b/>
+          <w:i w:val="0"/>
+          <w:color w:val="1D5051"/>
+          <w:sz w:val="22"/>
+        </w:rPr>
+        <w:t xml:space="preserve">Response. </w:t>
+      </w:r>
+      <w:r>
+        <w:rPr>
+          <w:rFonts w:ascii="Calibri" w:hAnsi="Calibri"/>
+          <w:b w:val="0"/>
+          <w:i w:val="0"/>
+          <w:color w:val="000000"/>
+          <w:sz w:val="22"/>
+        </w:rPr>
+        <w:t>We revised the identified sentences. The current manuscript presents the monitoring intervals, predictor definitions, and model structures in direct prose and does not retain the unclear colon constructions. The threshold-duration analysis discussed in the earlier draft was later removed in response to the journal review.</w:t>
+      </w:r>
+    </w:p>
+    <w:p>
+      <w:pPr>
+        <w:pStyle w:val="Heading2"/>
+        <w:keepNext/>
+      </w:pPr>
+      <w:r>
+        <w:t>Comment 5. Undefined acronyms</w:t>
+      </w:r>
+    </w:p>
+    <w:p>
+      <w:pPr>
+        <w:keepNext/>
+        <w:spacing w:before="0" w:after="80" w:line="264" w:lineRule="auto"/>
+        <w:ind w:left="72" w:right="72"/>
+        <w:shd w:fill="F2F5F7"/>
+      </w:pPr>
+      <w:r>
+        <w:rPr>
+          <w:rFonts w:ascii="Calibri" w:hAnsi="Calibri"/>
+          <w:b/>
+          <w:i w:val="0"/>
+          <w:color w:val="000000"/>
+          <w:sz w:val="22"/>
+        </w:rPr>
+        <w:t xml:space="preserve">Comment. </w:t>
+      </w:r>
+      <w:r>
+        <w:rPr>
+          <w:rFonts w:ascii="Calibri" w:hAnsi="Calibri"/>
+          <w:b w:val="0"/>
+          <w:i w:val="0"/>
+          <w:color w:val="000000"/>
+          <w:sz w:val="22"/>
+        </w:rPr>
+        <w:t>Define SC before using it. Avoid REML unless it has been defined, or write out the full statistical term if it is used only once.</w:t>
+      </w:r>
+    </w:p>
+    <w:p>
+      <w:pPr>
+        <w:spacing w:before="0" w:after="120" w:line="264" w:lineRule="auto"/>
+        <w:ind w:left="173"/>
+        <w:pBdr>
+          <w:left w:val="single" w:sz="18" w:space="7" w:color="2F6F70"/>
+        </w:pBdr>
+      </w:pPr>
+      <w:r>
+        <w:rPr>
+          <w:rFonts w:ascii="Calibri" w:hAnsi="Calibri"/>
+          <w:b/>
+          <w:i w:val="0"/>
+          <w:color w:val="1D5051"/>
+          <w:sz w:val="22"/>
+        </w:rPr>
+        <w:t xml:space="preserve">Response. </w:t>
+      </w:r>
+      <w:r>
+        <w:rPr>
+          <w:rFonts w:ascii="Calibri" w:hAnsi="Calibri"/>
+          <w:b w:val="0"/>
+          <w:i w:val="0"/>
+          <w:color w:val="000000"/>
+          <w:sz w:val="22"/>
+        </w:rPr>
+        <w:t>We agree. SC is defined at first use as Spring Canyon. The current statistical methods write out “restricted maximum likelihood” when explaining how selected formulas were refitted, so readers do not need an undefined abbreviation.</w:t>
+      </w:r>
+    </w:p>
+    <w:p>
+      <w:pPr>
+        <w:pStyle w:val="Heading2"/>
+        <w:keepNext/>
+      </w:pPr>
+      <w:r>
+        <w:t>Comment 6. Standalone figures and BI captions</w:t>
+      </w:r>
+    </w:p>
+    <w:p>
+      <w:pPr>
+        <w:keepNext/>
+        <w:spacing w:before="0" w:after="80" w:line="264" w:lineRule="auto"/>
+        <w:ind w:left="72" w:right="72"/>
+        <w:shd w:fill="F2F5F7"/>
+      </w:pPr>
+      <w:r>
+        <w:rPr>
+          <w:rFonts w:ascii="Calibri" w:hAnsi="Calibri"/>
+          <w:b/>
+          <w:i w:val="0"/>
+          <w:color w:val="000000"/>
+          <w:sz w:val="22"/>
+        </w:rPr>
+        <w:t xml:space="preserve">Comment. </w:t>
+      </w:r>
+      <w:r>
+        <w:rPr>
+          <w:rFonts w:ascii="Calibri" w:hAnsi="Calibri"/>
+          <w:b w:val="0"/>
+          <w:i w:val="0"/>
+          <w:color w:val="000000"/>
+          <w:sz w:val="22"/>
+        </w:rPr>
+        <w:t>Figures should stand alone. Define BI as Butterfly Index in the relevant captions, and introduce “Butterfly Index (BI)” before continuing to use the abbreviation.</w:t>
+      </w:r>
+    </w:p>
+    <w:p>
+      <w:pPr>
+        <w:spacing w:before="0" w:after="120" w:line="264" w:lineRule="auto"/>
+        <w:ind w:left="173"/>
+        <w:pBdr>
+          <w:left w:val="single" w:sz="18" w:space="7" w:color="2F6F70"/>
+        </w:pBdr>
+      </w:pPr>
+      <w:r>
+        <w:rPr>
+          <w:rFonts w:ascii="Calibri" w:hAnsi="Calibri"/>
+          <w:b/>
+          <w:i w:val="0"/>
+          <w:color w:val="1D5051"/>
+          <w:sz w:val="22"/>
+        </w:rPr>
+        <w:t xml:space="preserve">Response. </w:t>
+      </w:r>
+      <w:r>
+        <w:rPr>
+          <w:rFonts w:ascii="Calibri" w:hAnsi="Calibri"/>
+          <w:b w:val="0"/>
+          <w:i w:val="0"/>
+          <w:color w:val="000000"/>
+          <w:sz w:val="22"/>
+        </w:rPr>
+        <w:t>We revised the figure captions so retained figures define BI or spell out Butterfly Index. The Methods define Butterfly Index (BI) before the abbreviation is used throughout the analyses. The earlier temporal-window diagram associated with one of these comments was later removed.</w:t>
+      </w:r>
+    </w:p>
+    <w:p>
+      <w:pPr>
+        <w:pStyle w:val="Heading2"/>
+        <w:keepNext/>
+      </w:pPr>
+      <w:r>
+        <w:t>Comment 7. Cumulative sunlight predictor</w:t>
+      </w:r>
+    </w:p>
+    <w:p>
+      <w:pPr>
+        <w:keepNext/>
+        <w:spacing w:before="0" w:after="80" w:line="264" w:lineRule="auto"/>
+        <w:ind w:left="72" w:right="72"/>
+        <w:shd w:fill="F2F5F7"/>
+      </w:pPr>
+      <w:r>
+        <w:rPr>
+          <w:rFonts w:ascii="Calibri" w:hAnsi="Calibri"/>
+          <w:b/>
+          <w:i w:val="0"/>
+          <w:color w:val="000000"/>
+          <w:sz w:val="22"/>
+        </w:rPr>
+        <w:t xml:space="preserve">Comment. </w:t>
+      </w:r>
+      <w:r>
+        <w:rPr>
+          <w:rFonts w:ascii="Calibri" w:hAnsi="Calibri"/>
+          <w:b w:val="0"/>
+          <w:i w:val="0"/>
+          <w:color w:val="000000"/>
+          <w:sz w:val="22"/>
+        </w:rPr>
+        <w:t>Clarify why cumulative direct sun exposure was retained in the longer-window analysis.</w:t>
+      </w:r>
+    </w:p>
+    <w:p>
+      <w:pPr>
+        <w:spacing w:before="0" w:after="120" w:line="264" w:lineRule="auto"/>
+        <w:ind w:left="173"/>
+        <w:pBdr>
+          <w:left w:val="single" w:sz="18" w:space="7" w:color="2F6F70"/>
+        </w:pBdr>
+      </w:pPr>
+      <w:r>
+        <w:rPr>
+          <w:rFonts w:ascii="Calibri" w:hAnsi="Calibri"/>
+          <w:b/>
+          <w:i w:val="0"/>
+          <w:color w:val="1D5051"/>
+          <w:sz w:val="22"/>
+        </w:rPr>
+        <w:t xml:space="preserve">Response. </w:t>
+      </w:r>
+      <w:r>
+        <w:rPr>
+          <w:rFonts w:ascii="Calibri" w:hAnsi="Calibri"/>
+          <w:b w:val="0"/>
+          <w:i w:val="0"/>
+          <w:color w:val="000000"/>
+          <w:sz w:val="22"/>
+        </w:rPr>
+        <w:t>We expanded the definition and rationale. The current Methods define cumulative sun-exposed BI as the sum of sun-exposed BI across daylight images within the response window. It combines exposure duration with the indexed abundance visible in sunlit cells and serves as the longer-window solar-exposure predictor used to evaluate its conditional relationship with wind.</w:t>
+      </w:r>
+    </w:p>
+    <w:p>
+      <w:pPr>
+        <w:pStyle w:val="Heading2"/>
+        <w:keepNext/>
+      </w:pPr>
+      <w:r>
+        <w:t>Comment 8. Tables not visible in the review copy</w:t>
+      </w:r>
+    </w:p>
+    <w:p>
+      <w:pPr>
+        <w:keepNext/>
+        <w:spacing w:before="0" w:after="80" w:line="264" w:lineRule="auto"/>
+        <w:ind w:left="72" w:right="72"/>
+        <w:shd w:fill="F2F5F7"/>
+      </w:pPr>
+      <w:r>
+        <w:rPr>
+          <w:rFonts w:ascii="Calibri" w:hAnsi="Calibri"/>
+          <w:b/>
+          <w:i w:val="0"/>
+          <w:color w:val="000000"/>
+          <w:sz w:val="22"/>
+        </w:rPr>
+        <w:t xml:space="preserve">Comment. </w:t>
+      </w:r>
+      <w:r>
+        <w:rPr>
+          <w:rFonts w:ascii="Calibri" w:hAnsi="Calibri"/>
+          <w:b w:val="0"/>
+          <w:i w:val="0"/>
+          <w:color w:val="000000"/>
+          <w:sz w:val="22"/>
+        </w:rPr>
+        <w:t>Two statistical tables did not display in the review copy, so they could not be evaluated.</w:t>
+      </w:r>
+    </w:p>
+    <w:p>
+      <w:pPr>
+        <w:spacing w:before="0" w:after="120" w:line="264" w:lineRule="auto"/>
+        <w:ind w:left="173"/>
+        <w:pBdr>
+          <w:left w:val="single" w:sz="18" w:space="7" w:color="2F6F70"/>
+        </w:pBdr>
+      </w:pPr>
+      <w:r>
+        <w:rPr>
+          <w:rFonts w:ascii="Calibri" w:hAnsi="Calibri"/>
+          <w:b/>
+          <w:i w:val="0"/>
+          <w:color w:val="1D5051"/>
+          <w:sz w:val="22"/>
+        </w:rPr>
+        <w:t xml:space="preserve">Response. </w:t>
+      </w:r>
+      <w:r>
+        <w:rPr>
+          <w:rFonts w:ascii="Calibri" w:hAnsi="Calibri"/>
+          <w:b w:val="0"/>
+          <w:i w:val="0"/>
+          <w:color w:val="000000"/>
+          <w:sz w:val="22"/>
+        </w:rPr>
+        <w:t>Thank you for flagging the rendering problem. Those original tables are no longer part of the main text after the journal revision. The revised appendix contains the complete candidate definitions and rankings, and the same model information is available in machine-readable form with the public reproducibility materials.</w:t>
+      </w:r>
+    </w:p>
+    <w:p>
+      <w:pPr>
+        <w:pStyle w:val="Heading2"/>
+        <w:keepNext/>
+      </w:pPr>
+      <w:r>
+        <w:t>Comment 9. Wind and sunlight interaction explanation</w:t>
+      </w:r>
+    </w:p>
+    <w:p>
+      <w:pPr>
+        <w:keepNext/>
+        <w:spacing w:before="0" w:after="80" w:line="264" w:lineRule="auto"/>
+        <w:ind w:left="72" w:right="72"/>
+        <w:shd w:fill="F2F5F7"/>
+      </w:pPr>
+      <w:r>
+        <w:rPr>
+          <w:rFonts w:ascii="Calibri" w:hAnsi="Calibri"/>
+          <w:b/>
+          <w:i w:val="0"/>
+          <w:color w:val="000000"/>
+          <w:sz w:val="22"/>
+        </w:rPr>
+        <w:t xml:space="preserve">Comment. </w:t>
+      </w:r>
+      <w:r>
+        <w:rPr>
+          <w:rFonts w:ascii="Calibri" w:hAnsi="Calibri"/>
+          <w:b w:val="0"/>
+          <w:i w:val="0"/>
+          <w:color w:val="000000"/>
+          <w:sz w:val="22"/>
+        </w:rPr>
+        <w:t>The sentence describing the response at high numbers of butterflies in sunlight used an unclear colon and did not explain the sunlight condition as expected.</w:t>
+      </w:r>
+    </w:p>
+    <w:p>
+      <w:pPr>
+        <w:spacing w:before="0" w:after="120" w:line="264" w:lineRule="auto"/>
+        <w:ind w:left="173"/>
+        <w:pBdr>
+          <w:left w:val="single" w:sz="18" w:space="7" w:color="2F6F70"/>
+        </w:pBdr>
+      </w:pPr>
+      <w:r>
+        <w:rPr>
+          <w:rFonts w:ascii="Calibri" w:hAnsi="Calibri"/>
+          <w:b/>
+          <w:i w:val="0"/>
+          <w:color w:val="1D5051"/>
+          <w:sz w:val="22"/>
+        </w:rPr>
+        <w:t xml:space="preserve">Response. </w:t>
+      </w:r>
+      <w:r>
+        <w:rPr>
+          <w:rFonts w:ascii="Calibri" w:hAnsi="Calibri"/>
+          <w:b w:val="0"/>
+          <w:i w:val="0"/>
+          <w:color w:val="000000"/>
+          <w:sz w:val="22"/>
+        </w:rPr>
+        <w:t>We rewrote the interaction results. The current 30-minute analysis describes conditional wind slopes separately by temperature and sun-exposed BI. It states where slopes were negative, positive, or not distinguishable from zero and avoids the earlier sentence construction. The revised figure presents these conditional predictions directly.</w:t>
+      </w:r>
+    </w:p>
+    <w:p>
+      <w:pPr>
+        <w:pStyle w:val="Heading2"/>
+        <w:keepNext/>
+      </w:pPr>
+      <w:r>
+        <w:t>Comment 10. Future-research wording</w:t>
+      </w:r>
+    </w:p>
+    <w:p>
+      <w:pPr>
+        <w:keepNext/>
+        <w:spacing w:before="0" w:after="80" w:line="264" w:lineRule="auto"/>
+        <w:ind w:left="72" w:right="72"/>
+        <w:shd w:fill="F2F5F7"/>
+      </w:pPr>
+      <w:r>
+        <w:rPr>
+          <w:rFonts w:ascii="Calibri" w:hAnsi="Calibri"/>
+          <w:b/>
+          <w:i w:val="0"/>
+          <w:color w:val="000000"/>
+          <w:sz w:val="22"/>
+        </w:rPr>
+        <w:t xml:space="preserve">Comment. </w:t>
+      </w:r>
+      <w:r>
+        <w:rPr>
+          <w:rFonts w:ascii="Calibri" w:hAnsi="Calibri"/>
+          <w:b w:val="0"/>
+          <w:i w:val="0"/>
+          <w:color w:val="000000"/>
+          <w:sz w:val="22"/>
+        </w:rPr>
+        <w:t>Avoid saying that a proposed physiological model should be the next line of inquiry. Bureau review may view that wording as overly directive. Present it as something that could be investigated.</w:t>
+      </w:r>
+    </w:p>
+    <w:p>
+      <w:pPr>
+        <w:spacing w:before="0" w:after="120" w:line="264" w:lineRule="auto"/>
+        <w:ind w:left="173"/>
+        <w:pBdr>
+          <w:left w:val="single" w:sz="18" w:space="7" w:color="2F6F70"/>
+        </w:pBdr>
+      </w:pPr>
+      <w:r>
+        <w:rPr>
+          <w:rFonts w:ascii="Calibri" w:hAnsi="Calibri"/>
+          <w:b/>
+          <w:i w:val="0"/>
+          <w:color w:val="1D5051"/>
+          <w:sz w:val="22"/>
+        </w:rPr>
+        <w:t xml:space="preserve">Response. </w:t>
+      </w:r>
+      <w:r>
+        <w:rPr>
+          <w:rFonts w:ascii="Calibri" w:hAnsi="Calibri"/>
+          <w:b w:val="0"/>
+          <w:i w:val="0"/>
+          <w:color w:val="000000"/>
+          <w:sz w:val="22"/>
+        </w:rPr>
+        <w:t>We agree. The current Discussion presents physiological and energetic responses as a possible explanation that requires direct testing. The Conclusions call this a plausible direction for future research rather than prescribing the next study.</w:t>
+      </w:r>
+    </w:p>
+    <w:p>
+      <w:pPr>
+        <w:pStyle w:val="Heading2"/>
+        <w:keepNext/>
+      </w:pPr>
+      <w:r>
+        <w:t>Comment 11. Prescriptive management language</w:t>
+      </w:r>
+    </w:p>
+    <w:p>
+      <w:pPr>
+        <w:keepNext/>
+        <w:spacing w:before="0" w:after="80" w:line="264" w:lineRule="auto"/>
+        <w:ind w:left="72" w:right="72"/>
+        <w:shd w:fill="F2F5F7"/>
+      </w:pPr>
+      <w:r>
+        <w:rPr>
+          <w:rFonts w:ascii="Calibri" w:hAnsi="Calibri"/>
+          <w:b/>
+          <w:i w:val="0"/>
+          <w:color w:val="000000"/>
+          <w:sz w:val="22"/>
+        </w:rPr>
+        <w:t xml:space="preserve">Comment. </w:t>
+      </w:r>
+      <w:r>
+        <w:rPr>
+          <w:rFonts w:ascii="Calibri" w:hAnsi="Calibri"/>
+          <w:b w:val="0"/>
+          <w:i w:val="0"/>
+          <w:color w:val="000000"/>
+          <w:sz w:val="22"/>
+        </w:rPr>
+        <w:t>Avoid “recommend” when discussing how researchers or land managers should view the hypotheses. Use less directive language such as “suggest,” “consider,” or “propose.”</w:t>
+      </w:r>
+    </w:p>
+    <w:p>
+      <w:pPr>
+        <w:spacing w:before="0" w:after="120" w:line="264" w:lineRule="auto"/>
+        <w:ind w:left="173"/>
+        <w:pBdr>
+          <w:left w:val="single" w:sz="18" w:space="7" w:color="2F6F70"/>
+        </w:pBdr>
+      </w:pPr>
+      <w:r>
+        <w:rPr>
+          <w:rFonts w:ascii="Calibri" w:hAnsi="Calibri"/>
+          <w:b/>
+          <w:i w:val="0"/>
+          <w:color w:val="1D5051"/>
+          <w:sz w:val="22"/>
+        </w:rPr>
+        <w:t xml:space="preserve">Response. </w:t>
+      </w:r>
+      <w:r>
+        <w:rPr>
+          <w:rFonts w:ascii="Calibri" w:hAnsi="Calibri"/>
+          <w:b w:val="0"/>
+          <w:i w:val="0"/>
+          <w:color w:val="000000"/>
+          <w:sz w:val="22"/>
+        </w:rPr>
+        <w:t>We initially replaced “recommend” with less directive wording. During the journal revision, we went further and removed the management recommendations. The current manuscript limits its conclusions to the observed associations and the need for broader testing.</w:t>
+      </w:r>
+    </w:p>
+    <w:p>
+      <w:pPr>
+        <w:spacing w:before="0" w:after="120" w:line="264" w:lineRule="auto"/>
+      </w:pPr>
+      <w:r>
+        <w:rPr>
+          <w:rFonts w:ascii="Calibri" w:hAnsi="Calibri"/>
+          <w:b w:val="0"/>
+          <w:i w:val="0"/>
+          <w:color w:val="000000"/>
+          <w:sz w:val="22"/>
+        </w:rPr>
+        <w:t>We again thank the Academic Editor, the journal reviewers, and Zach Ancona for their careful comments. Their reviews led to a shorter, more transparent manuscript with narrower claims, corrected model comparisons, clearer measurement limitations, and stronger reproducibility materials.</w:t>
       </w:r>
     </w:p>
     <w:p>

</xml_diff>